<commit_message>
feat: design and fill vacancies report #BKDO-1026
</commit_message>
<xml_diff>
--- a/src/Bk.APG.Api/Templates/Vacancies_Report_French.docx
+++ b/src/Bk.APG.Api/Templates/Vacancies_Report_French.docx
@@ -653,7 +653,39 @@
           <w:szCs w:val="24"/>
           <w:lang w:val="en-US"/>
         </w:rPr>
-        <w:t>&lt;&lt;foreach [department in appendixReport.vacanciesCommittees]&gt;&gt;</w:t>
+        <w:t xml:space="preserve">&lt;&lt;foreach [department in </w:t>
+      </w:r>
+      <w:r>
+        <w:rPr>
+          <w:rFonts w:ascii="Times New Roman" w:hAnsi="Times New Roman"/>
+          <w:szCs w:val="24"/>
+          <w:lang w:val="en-US"/>
+        </w:rPr>
+        <w:t>vacanciesReport</w:t>
+      </w:r>
+      <w:r>
+        <w:rPr>
+          <w:rFonts w:ascii="Times New Roman" w:hAnsi="Times New Roman"/>
+          <w:szCs w:val="24"/>
+          <w:lang w:val="en-US"/>
+        </w:rPr>
+        <w:t>.</w:t>
+      </w:r>
+      <w:r>
+        <w:rPr>
+          <w:rFonts w:ascii="Times New Roman" w:hAnsi="Times New Roman"/>
+          <w:szCs w:val="24"/>
+          <w:lang w:val="en-US"/>
+        </w:rPr>
+        <w:t>departments</w:t>
+      </w:r>
+      <w:r>
+        <w:rPr>
+          <w:rFonts w:ascii="Times New Roman" w:hAnsi="Times New Roman"/>
+          <w:szCs w:val="24"/>
+          <w:lang w:val="en-US"/>
+        </w:rPr>
+        <w:t>]&gt;&gt;</w:t>
       </w:r>
     </w:p>
     <w:p>
@@ -664,8 +696,7 @@
           <w:lang w:val="fr-CH"/>
         </w:rPr>
       </w:pPr>
-      <w:bookmarkStart w:id="4" w:name="_Toc209534236"/>
-      <w:bookmarkStart w:id="5" w:name="_Toc222323189"/>
+      <w:bookmarkStart w:id="4" w:name="_Toc222306603"/>
       <w:r>
         <w:rPr>
           <w:rFonts w:ascii="Times New Roman" w:hAnsi="Times New Roman" w:cs="Times New Roman"/>
@@ -682,11 +713,10 @@
         <w:t xml:space="preserve"> &lt;&lt;[department.name]&gt;&gt;</w:t>
       </w:r>
       <w:bookmarkEnd w:id="4"/>
-      <w:bookmarkEnd w:id="5"/>
     </w:p>
     <w:p>
       <w:pPr>
-        <w:ind w:firstLine="284"/>
+        <w:ind w:left="567"/>
         <w:rPr>
           <w:rFonts w:ascii="Times New Roman" w:hAnsi="Times New Roman"/>
           <w:szCs w:val="24"/>
@@ -716,7 +746,7 @@
           <w:szCs w:val="24"/>
           <w:lang w:val="en-US"/>
         </w:rPr>
-        <w:t xml:space="preserve">]&gt;&gt;Keine </w:t>
+        <w:t>]&gt;&gt;</w:t>
       </w:r>
       <w:r>
         <w:rPr>
@@ -724,7 +754,7 @@
           <w:szCs w:val="24"/>
           <w:lang w:val="en-US"/>
         </w:rPr>
-        <w:t>Vakanz</w:t>
+        <w:t>FR_Keine Vakanz</w:t>
       </w:r>
       <w:r>
         <w:rPr>
@@ -762,12 +792,60 @@
           <w:numId w:val="41"/>
         </w:numPr>
         <w:spacing w:before="60" w:after="40"/>
-        <w:ind w:left="357" w:hanging="357"/>
+        <w:ind w:left="851" w:hanging="284"/>
+        <w:rPr>
+          <w:rFonts w:ascii="Times New Roman" w:eastAsia="Times New Roman" w:hAnsi="Times New Roman"/>
+          <w:b/>
+          <w:bCs/>
+          <w:sz w:val="24"/>
+          <w:szCs w:val="24"/>
+          <w:lang w:val="en-US" w:eastAsia="de-DE"/>
+        </w:rPr>
+      </w:pPr>
+      <w:r>
+        <w:rPr>
+          <w:rFonts w:ascii="Times New Roman" w:eastAsia="Times New Roman" w:hAnsi="Times New Roman"/>
+          <w:b/>
+          <w:bCs/>
+          <w:sz w:val="24"/>
+          <w:szCs w:val="24"/>
+          <w:lang w:val="en-US" w:eastAsia="de-DE"/>
+        </w:rPr>
+        <w:t>&lt;&lt;[</w:t>
+      </w:r>
+      <w:r>
+        <w:rPr>
+          <w:rFonts w:ascii="Times New Roman" w:hAnsi="Times New Roman"/>
+          <w:b/>
+          <w:bCs/>
+          <w:sz w:val="24"/>
+          <w:szCs w:val="24"/>
+          <w:lang w:val="en-US"/>
+        </w:rPr>
+        <w:t>committee.</w:t>
+      </w:r>
+      <w:r>
+        <w:rPr>
+          <w:rFonts w:ascii="Times New Roman" w:eastAsia="Times New Roman" w:hAnsi="Times New Roman"/>
+          <w:b/>
+          <w:bCs/>
+          <w:sz w:val="24"/>
+          <w:szCs w:val="24"/>
+          <w:lang w:val="en-US" w:eastAsia="de-DE"/>
+        </w:rPr>
+        <w:t>name]&gt;&gt;</w:t>
+      </w:r>
+    </w:p>
+    <w:p>
+      <w:pPr>
+        <w:pStyle w:val="Listenabsatz"/>
+        <w:spacing w:before="60" w:after="40"/>
+        <w:ind w:left="851"/>
         <w:rPr>
           <w:rFonts w:ascii="Times New Roman" w:eastAsia="Times New Roman" w:hAnsi="Times New Roman"/>
           <w:sz w:val="24"/>
           <w:szCs w:val="24"/>
-          <w:lang w:val="en-US" w:eastAsia="de-DE"/>
+          <w:lang w:eastAsia="de-DE"/>
         </w:rPr>
       </w:pPr>
       <w:r>
@@ -775,34 +853,42 @@
           <w:rFonts w:ascii="Times New Roman" w:eastAsia="Times New Roman" w:hAnsi="Times New Roman"/>
           <w:sz w:val="24"/>
           <w:szCs w:val="24"/>
-          <w:lang w:val="en-US" w:eastAsia="de-DE"/>
-        </w:rPr>
-        <w:t>&lt;&lt;[</w:t>
-      </w:r>
-      <w:r>
-        <w:rPr>
-          <w:rFonts w:ascii="Times New Roman" w:hAnsi="Times New Roman"/>
-          <w:sz w:val="24"/>
-          <w:szCs w:val="24"/>
-          <w:lang w:val="en-US"/>
-        </w:rPr>
-        <w:t>committee.</w:t>
+          <w:lang w:eastAsia="de-DE"/>
+        </w:rPr>
+        <w:t>FR_</w:t>
       </w:r>
       <w:r>
         <w:rPr>
           <w:rFonts w:ascii="Times New Roman" w:eastAsia="Times New Roman" w:hAnsi="Times New Roman"/>
           <w:sz w:val="24"/>
           <w:szCs w:val="24"/>
-          <w:lang w:val="en-US" w:eastAsia="de-DE"/>
-        </w:rPr>
-        <w:t>name]&gt;&gt;</w:t>
+          <w:lang w:eastAsia="de-DE"/>
+        </w:rPr>
+        <w:t>Anzahl Vakanzen: &lt;&lt;[</w:t>
+      </w:r>
+      <w:r>
+        <w:rPr>
+          <w:rFonts w:ascii="Times New Roman" w:hAnsi="Times New Roman"/>
+          <w:sz w:val="24"/>
+          <w:szCs w:val="24"/>
+        </w:rPr>
+        <w:t>committee.</w:t>
+      </w:r>
+      <w:r>
+        <w:rPr>
+          <w:rFonts w:ascii="Times New Roman" w:eastAsia="Times New Roman" w:hAnsi="Times New Roman"/>
+          <w:sz w:val="24"/>
+          <w:szCs w:val="24"/>
+          <w:lang w:eastAsia="de-DE"/>
+        </w:rPr>
+        <w:t>memberCount]&gt;&gt;</w:t>
       </w:r>
     </w:p>
     <w:p>
       <w:pPr>
         <w:pStyle w:val="Listenabsatz"/>
         <w:spacing w:before="60" w:after="40"/>
-        <w:ind w:left="357"/>
+        <w:ind w:left="851"/>
         <w:rPr>
           <w:rFonts w:ascii="Times New Roman" w:eastAsia="Times New Roman" w:hAnsi="Times New Roman"/>
           <w:sz w:val="24"/>
@@ -812,12 +898,34 @@
       </w:pPr>
       <w:r>
         <w:rPr>
+          <w:rFonts w:ascii="Times New Roman" w:hAnsi="Times New Roman"/>
+          <w:szCs w:val="24"/>
+          <w:lang w:val="en-US"/>
+        </w:rPr>
+        <w:t xml:space="preserve">&lt;&lt;if [committee.freeText != null &amp;&amp; committee.freeText != </w:t>
+      </w:r>
+      <w:r>
+        <w:rPr>
+          <w:rFonts w:ascii="Times New Roman" w:hAnsi="Times New Roman"/>
+          <w:szCs w:val="24"/>
+        </w:rPr>
+        <w:t>""]&gt;&gt;</w:t>
+      </w:r>
+      <w:r>
+        <w:rPr>
+          <w:rFonts w:ascii="Times New Roman" w:hAnsi="Times New Roman"/>
+          <w:szCs w:val="24"/>
+        </w:rPr>
+        <w:t>FR_</w:t>
+      </w:r>
+      <w:r>
+        <w:rPr>
           <w:rFonts w:ascii="Times New Roman" w:eastAsia="Times New Roman" w:hAnsi="Times New Roman"/>
           <w:sz w:val="24"/>
           <w:szCs w:val="24"/>
           <w:lang w:eastAsia="de-DE"/>
         </w:rPr>
-        <w:t>FR_</w:t>
+        <w:t>Gesetzlich vorgeschriebene Interessenvertretungen:</w:t>
       </w:r>
       <w:r>
         <w:rPr>
@@ -826,7 +934,7 @@
           <w:szCs w:val="24"/>
           <w:lang w:eastAsia="de-DE"/>
         </w:rPr>
-        <w:t>Anzahl Vakanzen</w:t>
+        <w:t xml:space="preserve"> </w:t>
       </w:r>
       <w:r>
         <w:rPr>
@@ -835,7 +943,16 @@
           <w:szCs w:val="24"/>
           <w:lang w:eastAsia="de-DE"/>
         </w:rPr>
-        <w:t xml:space="preserve"> </w:t>
+        <w:t>&lt;&lt;[</w:t>
+      </w:r>
+      <w:r>
+        <w:rPr>
+          <w:rFonts w:ascii="Times New Roman" w:hAnsi="Times New Roman"/>
+          <w:bCs/>
+          <w:sz w:val="24"/>
+          <w:szCs w:val="24"/>
+        </w:rPr>
+        <w:t>committee.</w:t>
       </w:r>
       <w:r>
         <w:rPr>
@@ -844,196 +961,73 @@
           <w:szCs w:val="24"/>
           <w:lang w:eastAsia="de-DE"/>
         </w:rPr>
-        <w:t>: &lt;&lt;[</w:t>
-      </w:r>
-      <w:r>
-        <w:rPr>
-          <w:rFonts w:ascii="Times New Roman" w:hAnsi="Times New Roman"/>
-          <w:sz w:val="24"/>
-          <w:szCs w:val="24"/>
-        </w:rPr>
-        <w:t>committee.</w:t>
-      </w:r>
-      <w:r>
+        <w:t>freeText]&gt;&gt;</w:t>
+      </w:r>
+      <w:r>
+        <w:rPr>
+          <w:rFonts w:ascii="Times New Roman" w:hAnsi="Times New Roman"/>
+          <w:szCs w:val="24"/>
+        </w:rPr>
+        <w:t>&lt;&lt;/if&gt;&gt;</w:t>
+      </w:r>
+    </w:p>
+    <w:p>
+      <w:pPr>
+        <w:pStyle w:val="Listenabsatz"/>
+        <w:spacing w:before="60" w:after="40"/>
+        <w:ind w:left="851"/>
         <w:rPr>
           <w:rFonts w:ascii="Times New Roman" w:eastAsia="Times New Roman" w:hAnsi="Times New Roman"/>
           <w:sz w:val="24"/>
           <w:szCs w:val="24"/>
-          <w:lang w:eastAsia="de-DE"/>
-        </w:rPr>
-        <w:t>memberCount]&gt;&gt;</w:t>
+          <w:lang w:val="en-US" w:eastAsia="de-DE"/>
+        </w:rPr>
+      </w:pPr>
+      <w:r>
+        <w:rPr>
+          <w:rFonts w:ascii="Times New Roman" w:eastAsia="Times New Roman" w:hAnsi="Times New Roman"/>
+          <w:sz w:val="24"/>
+          <w:szCs w:val="24"/>
+          <w:lang w:val="en-US" w:eastAsia="de-DE"/>
+        </w:rPr>
+        <w:t>&lt;&lt;if [!string.IsNullOrWhiteSpace(committee.freeText2)]&gt;&gt;</w:t>
+      </w:r>
+      <w:r>
+        <w:rPr>
+          <w:rFonts w:ascii="Times New Roman" w:eastAsia="Times New Roman" w:hAnsi="Times New Roman"/>
+          <w:sz w:val="24"/>
+          <w:szCs w:val="24"/>
+          <w:lang w:val="en-US" w:eastAsia="de-DE"/>
+        </w:rPr>
+        <w:t>FR_</w:t>
+      </w:r>
+      <w:r>
+        <w:rPr>
+          <w:rFonts w:ascii="Times New Roman" w:eastAsia="Times New Roman" w:hAnsi="Times New Roman"/>
+          <w:sz w:val="24"/>
+          <w:szCs w:val="24"/>
+          <w:lang w:val="en-US" w:eastAsia="de-DE"/>
+        </w:rPr>
+        <w:t>Webseite des Gremiums: &lt;</w:t>
+      </w:r>
+      <w:r>
+        <w:rPr>
+          <w:rFonts w:ascii="Times New Roman" w:eastAsia="Times New Roman" w:hAnsi="Times New Roman"/>
+          <w:sz w:val="24"/>
+          <w:szCs w:val="24"/>
+          <w:lang w:val="en-US" w:eastAsia="de-DE"/>
+        </w:rPr>
+        <w:t>&lt;[committee.freeText2]&gt;&gt;&lt;&lt;/if&gt;&gt;</w:t>
       </w:r>
     </w:p>
     <w:p>
       <w:pPr>
         <w:pStyle w:val="Listenabsatz"/>
-        <w:spacing w:before="60" w:after="40"/>
-        <w:ind w:left="357"/>
-        <w:rPr>
-          <w:rFonts w:ascii="Times New Roman" w:eastAsia="Times New Roman" w:hAnsi="Times New Roman"/>
-          <w:sz w:val="24"/>
-          <w:szCs w:val="24"/>
-          <w:lang w:eastAsia="de-DE"/>
-        </w:rPr>
-      </w:pPr>
-      <w:r>
-        <w:rPr>
-          <w:rFonts w:ascii="Times New Roman" w:eastAsia="Times New Roman" w:hAnsi="Times New Roman"/>
-          <w:sz w:val="24"/>
-          <w:szCs w:val="24"/>
-          <w:lang w:eastAsia="de-DE"/>
-        </w:rPr>
-        <w:t>FR_</w:t>
-      </w:r>
-      <w:r>
-        <w:rPr>
-          <w:rFonts w:ascii="Times New Roman" w:eastAsia="Times New Roman" w:hAnsi="Times New Roman"/>
-          <w:sz w:val="24"/>
-          <w:szCs w:val="24"/>
-          <w:lang w:eastAsia="de-DE"/>
-        </w:rPr>
-        <w:t>Gesetzlich vorgeschriebene Interessenvertretungen</w:t>
-      </w:r>
-      <w:r>
-        <w:rPr>
-          <w:rFonts w:ascii="Times New Roman" w:eastAsia="Times New Roman" w:hAnsi="Times New Roman"/>
-          <w:sz w:val="24"/>
-          <w:szCs w:val="24"/>
-          <w:lang w:eastAsia="de-DE"/>
-        </w:rPr>
-        <w:t xml:space="preserve"> </w:t>
-      </w:r>
-      <w:r>
-        <w:rPr>
-          <w:rFonts w:ascii="Times New Roman" w:eastAsia="Times New Roman" w:hAnsi="Times New Roman"/>
-          <w:sz w:val="24"/>
-          <w:szCs w:val="24"/>
-          <w:lang w:eastAsia="de-DE"/>
-        </w:rPr>
-        <w:t>:</w:t>
-      </w:r>
-      <w:r>
-        <w:rPr>
-          <w:rFonts w:ascii="Times New Roman" w:eastAsia="Times New Roman" w:hAnsi="Times New Roman"/>
-          <w:sz w:val="24"/>
-          <w:szCs w:val="24"/>
-          <w:lang w:eastAsia="de-DE"/>
-        </w:rPr>
-        <w:t xml:space="preserve"> </w:t>
-      </w:r>
-      <w:r>
-        <w:rPr>
-          <w:rFonts w:ascii="Times New Roman" w:eastAsia="Times New Roman" w:hAnsi="Times New Roman"/>
-          <w:sz w:val="24"/>
-          <w:szCs w:val="24"/>
-          <w:lang w:eastAsia="de-DE"/>
-        </w:rPr>
-        <w:t>&lt;&lt;[</w:t>
-      </w:r>
-      <w:r>
-        <w:rPr>
-          <w:rFonts w:ascii="Times New Roman" w:hAnsi="Times New Roman"/>
-          <w:bCs/>
-          <w:sz w:val="24"/>
-          <w:szCs w:val="24"/>
-        </w:rPr>
-        <w:t>committee.</w:t>
-      </w:r>
-      <w:r>
-        <w:rPr>
-          <w:rFonts w:ascii="Times New Roman" w:eastAsia="Times New Roman" w:hAnsi="Times New Roman"/>
-          <w:sz w:val="24"/>
-          <w:szCs w:val="24"/>
-          <w:lang w:eastAsia="de-DE"/>
-        </w:rPr>
-        <w:t>freeText]&gt;&gt;</w:t>
-      </w:r>
-    </w:p>
-    <w:p>
-      <w:pPr>
-        <w:pStyle w:val="Listenabsatz"/>
-        <w:spacing w:before="60" w:after="40"/>
-        <w:ind w:left="357"/>
-        <w:rPr>
-          <w:rFonts w:ascii="Times New Roman" w:eastAsia="Times New Roman" w:hAnsi="Times New Roman"/>
-          <w:sz w:val="24"/>
-          <w:szCs w:val="24"/>
-          <w:lang w:val="en-US" w:eastAsia="de-DE"/>
-        </w:rPr>
-      </w:pPr>
-      <w:r>
-        <w:rPr>
-          <w:rFonts w:ascii="Times New Roman" w:eastAsia="Times New Roman" w:hAnsi="Times New Roman"/>
-          <w:sz w:val="24"/>
-          <w:szCs w:val="24"/>
-          <w:lang w:val="en-US" w:eastAsia="de-DE"/>
-        </w:rPr>
-        <w:t>FR_</w:t>
-      </w:r>
-      <w:r>
-        <w:rPr>
-          <w:rFonts w:ascii="Times New Roman" w:eastAsia="Times New Roman" w:hAnsi="Times New Roman"/>
-          <w:sz w:val="24"/>
-          <w:szCs w:val="24"/>
-          <w:lang w:val="en-US" w:eastAsia="de-DE"/>
-        </w:rPr>
-        <w:t>Webseite des Gremiums</w:t>
-      </w:r>
-      <w:r>
-        <w:rPr>
-          <w:rFonts w:ascii="Times New Roman" w:eastAsia="Times New Roman" w:hAnsi="Times New Roman"/>
-          <w:sz w:val="24"/>
-          <w:szCs w:val="24"/>
-          <w:lang w:val="en-US" w:eastAsia="de-DE"/>
-        </w:rPr>
-        <w:t xml:space="preserve"> </w:t>
-      </w:r>
-      <w:r>
-        <w:rPr>
-          <w:rFonts w:ascii="Times New Roman" w:eastAsia="Times New Roman" w:hAnsi="Times New Roman"/>
-          <w:sz w:val="24"/>
-          <w:szCs w:val="24"/>
-          <w:lang w:val="en-US" w:eastAsia="de-DE"/>
-        </w:rPr>
-        <w:t>: &lt;&lt;[</w:t>
-      </w:r>
-      <w:r>
-        <w:rPr>
-          <w:rFonts w:ascii="Times New Roman" w:hAnsi="Times New Roman"/>
-          <w:sz w:val="24"/>
+        <w:ind w:left="0"/>
+        <w:rPr>
+          <w:rFonts w:ascii="Times New Roman" w:hAnsi="Times New Roman"/>
           <w:szCs w:val="24"/>
           <w:lang w:val="en-US"/>
-        </w:rPr>
-        <w:t>committee.</w:t>
-      </w:r>
-      <w:r>
-        <w:rPr>
-          <w:rFonts w:ascii="Times New Roman" w:eastAsia="Times New Roman" w:hAnsi="Times New Roman"/>
-          <w:sz w:val="24"/>
-          <w:szCs w:val="24"/>
-          <w:lang w:val="en-US" w:eastAsia="de-DE"/>
-        </w:rPr>
-        <w:t>freeText2</w:t>
-      </w:r>
-      <w:r>
-        <w:rPr>
-          <w:rFonts w:ascii="Times New Roman" w:eastAsia="Times New Roman" w:hAnsi="Times New Roman"/>
-          <w:sz w:val="24"/>
-          <w:szCs w:val="24"/>
-          <w:lang w:val="en-US" w:eastAsia="de-DE"/>
-        </w:rPr>
-        <w:t>]&gt;&gt;</w:t>
-      </w:r>
-    </w:p>
-    <w:p>
-      <w:pPr>
-        <w:pStyle w:val="Listenabsatz"/>
-        <w:ind w:left="0"/>
-        <w:rPr>
-          <w:rFonts w:ascii="Times New Roman" w:eastAsia="Times New Roman" w:hAnsi="Times New Roman"/>
-          <w:sz w:val="24"/>
-          <w:szCs w:val="24"/>
-          <w:lang w:val="en-US" w:eastAsia="de-DE"/>
         </w:rPr>
       </w:pPr>
       <w:r>
@@ -1046,6 +1040,14 @@
         </w:rPr>
         <w:t>&lt;&lt;/foreach&gt;&gt;</w:t>
       </w:r>
+      <w:r>
+        <w:rPr>
+          <w:rFonts w:ascii="Times New Roman" w:hAnsi="Times New Roman"/>
+          <w:szCs w:val="24"/>
+          <w:lang w:val="en-US"/>
+        </w:rPr>
+        <w:t>&lt;&lt;/foreach&gt;&gt;</w:t>
+      </w:r>
     </w:p>
     <w:p>
       <w:pPr>
@@ -1055,14 +1057,6 @@
           <w:lang w:val="en-US"/>
         </w:rPr>
       </w:pPr>
-      <w:r>
-        <w:rPr>
-          <w:rFonts w:ascii="Times New Roman" w:hAnsi="Times New Roman"/>
-          <w:szCs w:val="24"/>
-          <w:lang w:val="en-US"/>
-        </w:rPr>
-        <w:t>&lt;&lt;/foreach&gt;&gt;</w:t>
-      </w:r>
     </w:p>
     <w:sectPr>
       <w:headerReference w:type="default" r:id="rId8"/>

</xml_diff>